<commit_message>
Site updated: 2021-12-08 07:44:16
</commit_message>
<xml_diff>
--- a/treasure/download/经藏/宝积部-65部/新建文件夹/佛说阿弥陀经-姚秦-鸠摩罗什.docx
+++ b/treasure/download/经藏/宝积部-65部/新建文件夹/佛说阿弥陀经-姚秦-鸠摩罗什.docx
@@ -4,7 +4,6 @@
   <w:body>
     <w:p>
       <w:pPr>
-        <w:jc w:val="center"/>
         <w:rPr>
           <w:rFonts w:ascii="楷体" w:eastAsia="楷体" w:hAnsi="楷体"/>
           <w:sz w:val="24"/>
@@ -24,7 +23,7 @@
     </w:p>
     <w:p>
       <w:pPr>
-        <w:jc w:val="center"/>
+        <w:ind w:firstLineChars="200" w:firstLine="480"/>
         <w:rPr>
           <w:rFonts w:ascii="楷体" w:eastAsia="楷体" w:hAnsi="楷体"/>
           <w:sz w:val="24"/>
@@ -76,7 +75,16 @@
           <w:szCs w:val="24"/>
           <w:shd w:val="pct15" w:color="auto" w:fill="FFFFFF"/>
         </w:rPr>
-        <w:t>连。摩诃迦叶。摩诃迦栴延。摩诃拘絺罗。离婆多。周梨盘陀迦。难陀。阿难陀。罗睺罗。憍梵波提。宾头卢颇罗堕。迦留陀夷。摩诃劫宾那。薄俱罗。阿</w:t>
+        <w:t>连。摩诃迦叶。摩诃迦栴延。摩诃拘絺罗。离婆多。周梨盘陀伽</w:t>
+      </w:r>
+      <w:r>
+        <w:rPr>
+          <w:rFonts w:ascii="楷体" w:eastAsia="楷体" w:hAnsi="楷体" w:hint="eastAsia"/>
+          <w:sz w:val="24"/>
+          <w:szCs w:val="24"/>
+          <w:shd w:val="pct15" w:color="auto" w:fill="FFFFFF"/>
+        </w:rPr>
+        <w:t>。难陀。阿难陀。罗睺罗。憍梵波提。宾头卢颇罗堕。迦留陀夷。摩诃劫宾那。薄俱罗。阿</w:t>
       </w:r>
       <w:r>
         <w:rPr>
@@ -118,40 +126,42 @@
     </w:p>
     <w:p>
       <w:pPr>
-        <w:rPr>
-          <w:rFonts w:ascii="楷体" w:eastAsia="楷体" w:hAnsi="楷体"/>
-          <w:sz w:val="24"/>
-          <w:szCs w:val="24"/>
-          <w:shd w:val="pct15" w:color="auto" w:fill="FFFFFF"/>
-        </w:rPr>
-      </w:pPr>
-      <w:r>
-        <w:rPr>
-          <w:rFonts w:ascii="楷体" w:eastAsia="楷体" w:hAnsi="楷体" w:hint="eastAsia"/>
-          <w:sz w:val="24"/>
-          <w:szCs w:val="24"/>
-          <w:shd w:val="pct15" w:color="auto" w:fill="FFFFFF"/>
-        </w:rPr>
-        <w:t xml:space="preserve">　　尔时佛告长老舍利弗。从是西方过十万亿佛土。有世界名曰极乐。其土有佛号阿弥陀。今现在说法。</w:t>
-      </w:r>
-    </w:p>
-    <w:p>
-      <w:pPr>
-        <w:rPr>
-          <w:rFonts w:ascii="楷体" w:eastAsia="楷体" w:hAnsi="楷体"/>
-          <w:sz w:val="24"/>
-          <w:szCs w:val="24"/>
-          <w:shd w:val="pct15" w:color="auto" w:fill="FFFFFF"/>
-        </w:rPr>
-      </w:pPr>
-      <w:r>
-        <w:rPr>
-          <w:rFonts w:ascii="楷体" w:eastAsia="楷体" w:hAnsi="楷体" w:hint="eastAsia"/>
-          <w:sz w:val="24"/>
-          <w:szCs w:val="24"/>
-          <w:shd w:val="pct15" w:color="auto" w:fill="FFFFFF"/>
-        </w:rPr>
-        <w:t xml:space="preserve">　　舍利弗。彼土何故名为极乐。其国众生无有众苦。但受诸乐。故名极乐。</w:t>
+        <w:ind w:firstLine="480"/>
+        <w:rPr>
+          <w:rFonts w:ascii="楷体" w:eastAsia="楷体" w:hAnsi="楷体"/>
+          <w:sz w:val="24"/>
+          <w:szCs w:val="24"/>
+          <w:shd w:val="pct15" w:color="auto" w:fill="FFFFFF"/>
+        </w:rPr>
+      </w:pPr>
+      <w:r>
+        <w:rPr>
+          <w:rFonts w:ascii="楷体" w:eastAsia="楷体" w:hAnsi="楷体" w:hint="eastAsia"/>
+          <w:sz w:val="24"/>
+          <w:szCs w:val="24"/>
+          <w:shd w:val="pct15" w:color="auto" w:fill="FFFFFF"/>
+        </w:rPr>
+        <w:t>尔时佛告长老舍利弗。从是西方过十万亿佛土。有世界名曰极乐。其土有佛号阿弥陀。今现在说法。</w:t>
+      </w:r>
+    </w:p>
+    <w:p>
+      <w:pPr>
+        <w:ind w:firstLine="480"/>
+        <w:rPr>
+          <w:rFonts w:ascii="楷体" w:eastAsia="楷体" w:hAnsi="楷体"/>
+          <w:sz w:val="24"/>
+          <w:szCs w:val="24"/>
+          <w:shd w:val="pct15" w:color="auto" w:fill="FFFFFF"/>
+        </w:rPr>
+      </w:pPr>
+      <w:r>
+        <w:rPr>
+          <w:rFonts w:ascii="楷体" w:eastAsia="楷体" w:hAnsi="楷体" w:hint="eastAsia"/>
+          <w:sz w:val="24"/>
+          <w:szCs w:val="24"/>
+          <w:shd w:val="pct15" w:color="auto" w:fill="FFFFFF"/>
+        </w:rPr>
+        <w:t>舍利弗。彼土何故名为极乐。其国众生无有众苦。但受诸乐。故名极乐。</w:t>
       </w:r>
     </w:p>
     <w:p>
@@ -244,7 +254,7 @@
           <w:szCs w:val="24"/>
           <w:shd w:val="pct15" w:color="auto" w:fill="FFFFFF"/>
         </w:rPr>
-        <w:t>赤珠马瑙而严饰之。池中莲花大如车轮。青色青光。黄色黄光。赤色赤光。白色白光。微妙香洁。</w:t>
+        <w:t>赤珠马瑙而严饰之。池中莲花大如车轮。青色青光。黄色黄光。赤色赤光。白色白光。微妙香洁。舍利弗。极乐国土成就如是功德庄严。</w:t>
       </w:r>
     </w:p>
     <w:p>
@@ -264,7 +274,71 @@
           <w:szCs w:val="24"/>
           <w:shd w:val="pct15" w:color="auto" w:fill="FFFFFF"/>
         </w:rPr>
-        <w:t>舍利弗。极乐国土成就如是功德庄严。</w:t>
+        <w:t>又舍利弗。彼佛国土常作天乐。黄金为地。昼夜六时天雨曼陀罗华。其国众生常以清旦</w:t>
+      </w:r>
+      <w:r>
+        <w:rPr>
+          <w:rFonts w:ascii="楷体" w:eastAsia="楷体" w:hAnsi="楷体" w:hint="eastAsia"/>
+          <w:sz w:val="24"/>
+          <w:szCs w:val="24"/>
+          <w:shd w:val="pct15" w:color="auto" w:fill="FFFFFF"/>
+        </w:rPr>
+        <w:t>。</w:t>
+      </w:r>
+      <w:r>
+        <w:rPr>
+          <w:rFonts w:ascii="楷体" w:eastAsia="楷体" w:hAnsi="楷体" w:hint="eastAsia"/>
+          <w:sz w:val="24"/>
+          <w:szCs w:val="24"/>
+          <w:shd w:val="pct15" w:color="auto" w:fill="FFFFFF"/>
+        </w:rPr>
+        <w:t>各以衣裓盛众妙华。供养他方十万亿佛。即以食时还到本国饭食经行。舍利弗。极乐国土成就如是功德庄严。</w:t>
+      </w:r>
+    </w:p>
+    <w:p>
+      <w:pPr>
+        <w:rPr>
+          <w:rFonts w:ascii="楷体" w:eastAsia="楷体" w:hAnsi="楷体"/>
+          <w:sz w:val="24"/>
+          <w:szCs w:val="24"/>
+          <w:shd w:val="pct15" w:color="auto" w:fill="FFFFFF"/>
+        </w:rPr>
+      </w:pPr>
+      <w:r>
+        <w:rPr>
+          <w:rFonts w:ascii="楷体" w:eastAsia="楷体" w:hAnsi="楷体" w:hint="eastAsia"/>
+          <w:sz w:val="24"/>
+          <w:szCs w:val="24"/>
+          <w:shd w:val="pct15" w:color="auto" w:fill="FFFFFF"/>
+        </w:rPr>
+        <w:t xml:space="preserve">　　复次舍利弗。彼国常有种种奇妙杂色之鸟。白鹄孔雀。鹦鹉舍利</w:t>
+      </w:r>
+      <w:r>
+        <w:rPr>
+          <w:rFonts w:ascii="楷体" w:eastAsia="楷体" w:hAnsi="楷体" w:hint="eastAsia"/>
+          <w:sz w:val="24"/>
+          <w:szCs w:val="24"/>
+          <w:shd w:val="pct15" w:color="auto" w:fill="FFFFFF"/>
+        </w:rPr>
+        <w:t>。迦陵频伽。共命之鸟。是诸众鸟</w:t>
+      </w:r>
+      <w:r>
+        <w:rPr>
+          <w:rFonts w:ascii="楷体" w:eastAsia="楷体" w:hAnsi="楷体" w:hint="eastAsia"/>
+          <w:sz w:val="24"/>
+          <w:szCs w:val="24"/>
+          <w:shd w:val="pct15" w:color="auto" w:fill="FFFFFF"/>
+        </w:rPr>
+        <w:t>昼夜六时出和雅音。其音演畅五根</w:t>
+      </w:r>
+      <w:r>
+        <w:rPr>
+          <w:rFonts w:ascii="楷体" w:eastAsia="楷体" w:hAnsi="楷体" w:hint="eastAsia"/>
+          <w:sz w:val="24"/>
+          <w:szCs w:val="24"/>
+          <w:shd w:val="pct15" w:color="auto" w:fill="FFFFFF"/>
+        </w:rPr>
+        <w:t>五力。七菩提分。八圣道分如是等法。其土众生闻是音已。皆悉念佛念法念僧。舍利弗。汝勿谓此鸟实是罪报所生。所以者何。彼佛国土无三恶趣。舍利弗。其佛国土尚无三恶道之名。何况有实。是诸众鸟皆是阿弥陀佛欲令法音宣流。变化所作。</w:t>
       </w:r>
     </w:p>
     <w:p>
@@ -284,7 +358,26 @@
           <w:szCs w:val="24"/>
           <w:shd w:val="pct15" w:color="auto" w:fill="FFFFFF"/>
         </w:rPr>
-        <w:t>又舍利弗。彼佛国土常作天乐。黄金为地。昼夜六时天雨曼陀罗华。其国众生常以清旦各以衣裓盛众妙华。供养他方十万亿佛。即以食时还到本国饭食经行。</w:t>
+        <w:t>舍利弗。彼佛国土微风吹动。诸宝行树及宝罗网出微妙音。譬如百千种乐同时俱作。闻是音者皆自然生念佛念法念僧之心。舍利弗。其佛国土成就如是功德庄严。</w:t>
+      </w:r>
+    </w:p>
+    <w:p>
+      <w:pPr>
+        <w:rPr>
+          <w:rFonts w:ascii="楷体" w:eastAsia="楷体" w:hAnsi="楷体"/>
+          <w:sz w:val="24"/>
+          <w:szCs w:val="24"/>
+          <w:shd w:val="pct15" w:color="auto" w:fill="FFFFFF"/>
+        </w:rPr>
+      </w:pPr>
+      <w:r>
+        <w:rPr>
+          <w:rFonts w:ascii="楷体" w:eastAsia="楷体" w:hAnsi="楷体" w:hint="eastAsia"/>
+          <w:sz w:val="24"/>
+          <w:szCs w:val="24"/>
+          <w:shd w:val="pct15" w:color="auto" w:fill="FFFFFF"/>
+        </w:rPr>
+        <w:t xml:space="preserve">　　舍利弗。于汝意云何。彼佛何故号阿弥陀。舍利弗。彼佛光明无量。照十方国无所障碍。是故号为阿弥陀。又舍利弗。彼佛寿命及其人民无量无边阿僧祇劫。故名阿弥陀。舍利弗。阿弥陀佛成佛已来于今十劫。</w:t>
       </w:r>
     </w:p>
     <w:p>
@@ -304,220 +397,7 @@
           <w:szCs w:val="24"/>
           <w:shd w:val="pct15" w:color="auto" w:fill="FFFFFF"/>
         </w:rPr>
-        <w:t>舍利弗。极乐国土成就如是功德庄严。</w:t>
-      </w:r>
-    </w:p>
-    <w:p>
-      <w:pPr>
-        <w:rPr>
-          <w:rFonts w:ascii="楷体" w:eastAsia="楷体" w:hAnsi="楷体"/>
-          <w:sz w:val="24"/>
-          <w:szCs w:val="24"/>
-          <w:shd w:val="pct15" w:color="auto" w:fill="FFFFFF"/>
-        </w:rPr>
-      </w:pPr>
-      <w:r>
-        <w:rPr>
-          <w:rFonts w:ascii="楷体" w:eastAsia="楷体" w:hAnsi="楷体" w:hint="eastAsia"/>
-          <w:sz w:val="24"/>
-          <w:szCs w:val="24"/>
-          <w:shd w:val="pct15" w:color="auto" w:fill="FFFFFF"/>
-        </w:rPr>
-        <w:t xml:space="preserve">　　复次舍利弗。彼国常有种种奇妙杂色之鸟。白鹄孔雀。鹦鹉舍利。迦陵频伽。共命之鸟。是诸众鸟。昼夜六时出和雅音。其音演畅五根。五力。七菩提分。八圣道分如是等法。其土众生闻是音已。皆悉念佛念法念僧。</w:t>
-      </w:r>
-    </w:p>
-    <w:p>
-      <w:pPr>
-        <w:rPr>
-          <w:rFonts w:ascii="楷体" w:eastAsia="楷体" w:hAnsi="楷体"/>
-          <w:sz w:val="24"/>
-          <w:szCs w:val="24"/>
-          <w:shd w:val="pct15" w:color="auto" w:fill="FFFFFF"/>
-        </w:rPr>
-      </w:pPr>
-      <w:r>
-        <w:rPr>
-          <w:rFonts w:ascii="楷体" w:eastAsia="楷体" w:hAnsi="楷体" w:hint="eastAsia"/>
-          <w:sz w:val="24"/>
-          <w:szCs w:val="24"/>
-          <w:shd w:val="pct15" w:color="auto" w:fill="FFFFFF"/>
-        </w:rPr>
-        <w:t xml:space="preserve">　　舍利弗。汝勿谓此鸟实是罪报所生。所以者何。彼佛国土无三恶趣。</w:t>
-      </w:r>
-    </w:p>
-    <w:p>
-      <w:pPr>
-        <w:rPr>
-          <w:rFonts w:ascii="楷体" w:eastAsia="楷体" w:hAnsi="楷体"/>
-          <w:sz w:val="24"/>
-          <w:szCs w:val="24"/>
-          <w:shd w:val="pct15" w:color="auto" w:fill="FFFFFF"/>
-        </w:rPr>
-      </w:pPr>
-      <w:r>
-        <w:rPr>
-          <w:rFonts w:ascii="楷体" w:eastAsia="楷体" w:hAnsi="楷体" w:hint="eastAsia"/>
-          <w:sz w:val="24"/>
-          <w:szCs w:val="24"/>
-          <w:shd w:val="pct15" w:color="auto" w:fill="FFFFFF"/>
-        </w:rPr>
-        <w:t xml:space="preserve">　　舍利弗。其佛国土尚无三恶道之名。何况有实。是诸众鸟皆是阿弥陀佛欲令法音宣流。变化所作。</w:t>
-      </w:r>
-    </w:p>
-    <w:p>
-      <w:pPr>
-        <w:ind w:firstLine="480"/>
-        <w:rPr>
-          <w:rFonts w:ascii="楷体" w:eastAsia="楷体" w:hAnsi="楷体"/>
-          <w:sz w:val="24"/>
-          <w:szCs w:val="24"/>
-          <w:shd w:val="pct15" w:color="auto" w:fill="FFFFFF"/>
-        </w:rPr>
-      </w:pPr>
-      <w:r>
-        <w:rPr>
-          <w:rFonts w:ascii="楷体" w:eastAsia="楷体" w:hAnsi="楷体" w:hint="eastAsia"/>
-          <w:sz w:val="24"/>
-          <w:szCs w:val="24"/>
-          <w:shd w:val="pct15" w:color="auto" w:fill="FFFFFF"/>
-        </w:rPr>
-        <w:t>舍利弗。彼佛国土微风吹动。诸宝行树及宝罗网出微妙音。譬如百千种乐同时俱作。闻是音者皆自然生念佛念法念僧之心。</w:t>
-      </w:r>
-    </w:p>
-    <w:p>
-      <w:pPr>
-        <w:ind w:firstLine="480"/>
-        <w:rPr>
-          <w:rFonts w:ascii="楷体" w:eastAsia="楷体" w:hAnsi="楷体"/>
-          <w:sz w:val="24"/>
-          <w:szCs w:val="24"/>
-          <w:shd w:val="pct15" w:color="auto" w:fill="FFFFFF"/>
-        </w:rPr>
-      </w:pPr>
-      <w:r>
-        <w:rPr>
-          <w:rFonts w:ascii="楷体" w:eastAsia="楷体" w:hAnsi="楷体" w:hint="eastAsia"/>
-          <w:sz w:val="24"/>
-          <w:szCs w:val="24"/>
-          <w:shd w:val="pct15" w:color="auto" w:fill="FFFFFF"/>
-        </w:rPr>
-        <w:t>舍利弗。其佛国土成就如是功德庄严。</w:t>
-      </w:r>
-    </w:p>
-    <w:p>
-      <w:pPr>
-        <w:rPr>
-          <w:rFonts w:ascii="楷体" w:eastAsia="楷体" w:hAnsi="楷体"/>
-          <w:sz w:val="24"/>
-          <w:szCs w:val="24"/>
-          <w:shd w:val="pct15" w:color="auto" w:fill="FFFFFF"/>
-        </w:rPr>
-      </w:pPr>
-      <w:r>
-        <w:rPr>
-          <w:rFonts w:ascii="楷体" w:eastAsia="楷体" w:hAnsi="楷体" w:hint="eastAsia"/>
-          <w:sz w:val="24"/>
-          <w:szCs w:val="24"/>
-          <w:shd w:val="pct15" w:color="auto" w:fill="FFFFFF"/>
-        </w:rPr>
-        <w:t xml:space="preserve">　　舍利弗。于汝意云何。彼佛何故号阿弥陀。</w:t>
-      </w:r>
-    </w:p>
-    <w:p>
-      <w:pPr>
-        <w:rPr>
-          <w:rFonts w:ascii="楷体" w:eastAsia="楷体" w:hAnsi="楷体"/>
-          <w:sz w:val="24"/>
-          <w:szCs w:val="24"/>
-          <w:shd w:val="pct15" w:color="auto" w:fill="FFFFFF"/>
-        </w:rPr>
-      </w:pPr>
-      <w:r>
-        <w:rPr>
-          <w:rFonts w:ascii="楷体" w:eastAsia="楷体" w:hAnsi="楷体" w:hint="eastAsia"/>
-          <w:sz w:val="24"/>
-          <w:szCs w:val="24"/>
-          <w:shd w:val="pct15" w:color="auto" w:fill="FFFFFF"/>
-        </w:rPr>
-        <w:t xml:space="preserve">　　舍利弗。彼佛光明无量。照十方国无所障碍。是故号为阿弥陀。</w:t>
-      </w:r>
-    </w:p>
-    <w:p>
-      <w:pPr>
-        <w:rPr>
-          <w:rFonts w:ascii="楷体" w:eastAsia="楷体" w:hAnsi="楷体"/>
-          <w:sz w:val="24"/>
-          <w:szCs w:val="24"/>
-          <w:shd w:val="pct15" w:color="auto" w:fill="FFFFFF"/>
-        </w:rPr>
-      </w:pPr>
-      <w:r>
-        <w:rPr>
-          <w:rFonts w:ascii="楷体" w:eastAsia="楷体" w:hAnsi="楷体" w:hint="eastAsia"/>
-          <w:sz w:val="24"/>
-          <w:szCs w:val="24"/>
-          <w:shd w:val="pct15" w:color="auto" w:fill="FFFFFF"/>
-        </w:rPr>
-        <w:t xml:space="preserve">　　又舍利弗。彼佛寿命及其人民无量无边阿僧祇劫。故名阿弥陀。</w:t>
-      </w:r>
-    </w:p>
-    <w:p>
-      <w:pPr>
-        <w:rPr>
-          <w:rFonts w:ascii="楷体" w:eastAsia="楷体" w:hAnsi="楷体"/>
-          <w:sz w:val="24"/>
-          <w:szCs w:val="24"/>
-          <w:shd w:val="pct15" w:color="auto" w:fill="FFFFFF"/>
-        </w:rPr>
-      </w:pPr>
-      <w:r>
-        <w:rPr>
-          <w:rFonts w:ascii="楷体" w:eastAsia="楷体" w:hAnsi="楷体" w:hint="eastAsia"/>
-          <w:sz w:val="24"/>
-          <w:szCs w:val="24"/>
-          <w:shd w:val="pct15" w:color="auto" w:fill="FFFFFF"/>
-        </w:rPr>
-        <w:t xml:space="preserve">　　舍利弗。阿弥陀佛成佛已来于今十劫。</w:t>
-      </w:r>
-    </w:p>
-    <w:p>
-      <w:pPr>
-        <w:ind w:firstLine="480"/>
-        <w:rPr>
-          <w:rFonts w:ascii="楷体" w:eastAsia="楷体" w:hAnsi="楷体"/>
-          <w:sz w:val="24"/>
-          <w:szCs w:val="24"/>
-          <w:shd w:val="pct15" w:color="auto" w:fill="FFFFFF"/>
-        </w:rPr>
-      </w:pPr>
-      <w:r>
-        <w:rPr>
-          <w:rFonts w:ascii="楷体" w:eastAsia="楷体" w:hAnsi="楷体" w:hint="eastAsia"/>
-          <w:sz w:val="24"/>
-          <w:szCs w:val="24"/>
-          <w:shd w:val="pct15" w:color="auto" w:fill="FFFFFF"/>
-        </w:rPr>
-        <w:t>又舍利弗。彼佛有无量无边声闻弟子。皆阿罗汉。非是算数之所能知。诸菩萨亦复如是。</w:t>
-      </w:r>
-    </w:p>
-    <w:p>
-      <w:pPr>
-        <w:ind w:firstLine="480"/>
-        <w:rPr>
-          <w:rFonts w:ascii="楷体" w:eastAsia="楷体" w:hAnsi="楷体"/>
-          <w:sz w:val="24"/>
-          <w:szCs w:val="24"/>
-          <w:shd w:val="pct15" w:color="auto" w:fill="FFFFFF"/>
-        </w:rPr>
-      </w:pPr>
-      <w:r>
-        <w:rPr>
-          <w:rFonts w:ascii="楷体" w:eastAsia="楷体" w:hAnsi="楷体" w:hint="eastAsia"/>
-          <w:sz w:val="24"/>
-          <w:szCs w:val="24"/>
-          <w:shd w:val="pct15" w:color="auto" w:fill="FFFFFF"/>
-        </w:rPr>
-        <w:t>舍利弗。彼佛国土成就如是功德庄严。</w:t>
+        <w:t>又舍利弗。彼佛有无量无边声闻弟子。皆阿罗汉。非是算数之所能知。诸菩萨亦复如是。舍利弗。彼佛国土成就如是功德庄严。</w:t>
       </w:r>
     </w:p>
     <w:p>
@@ -582,26 +462,7 @@
           <w:szCs w:val="24"/>
           <w:shd w:val="pct15" w:color="auto" w:fill="FFFFFF"/>
         </w:rPr>
-        <w:t>应当发愿愿生彼国。所以者何。得与如是诸上善人俱会一处。</w:t>
-      </w:r>
-    </w:p>
-    <w:p>
-      <w:pPr>
-        <w:rPr>
-          <w:rFonts w:ascii="楷体" w:eastAsia="楷体" w:hAnsi="楷体"/>
-          <w:sz w:val="24"/>
-          <w:szCs w:val="24"/>
-          <w:shd w:val="pct15" w:color="auto" w:fill="FFFFFF"/>
-        </w:rPr>
-      </w:pPr>
-      <w:r>
-        <w:rPr>
-          <w:rFonts w:ascii="楷体" w:eastAsia="楷体" w:hAnsi="楷体" w:hint="eastAsia"/>
-          <w:sz w:val="24"/>
-          <w:szCs w:val="24"/>
-          <w:shd w:val="pct15" w:color="auto" w:fill="FFFFFF"/>
-        </w:rPr>
-        <w:t xml:space="preserve">　　舍利弗。不可以少善根福德因缘得生彼国。</w:t>
+        <w:t>应当发愿愿生彼国。所以者何。得与如是诸上善人俱会一处。舍利弗。不可以少善根福德因缘得生彼国。</w:t>
       </w:r>
     </w:p>
     <w:p>
@@ -629,26 +490,7 @@
           <w:szCs w:val="24"/>
           <w:shd w:val="pct15" w:color="auto" w:fill="FFFFFF"/>
         </w:rPr>
-        <w:t>若一日若二日若三日若四日若五日若六日若七日。一心不乱。其人临命终时。阿弥陀佛与诸圣众现在其前。是人终时心不颠倒。即得往生阿弥陀佛极乐国土。</w:t>
-      </w:r>
-    </w:p>
-    <w:p>
-      <w:pPr>
-        <w:rPr>
-          <w:rFonts w:ascii="楷体" w:eastAsia="楷体" w:hAnsi="楷体"/>
-          <w:sz w:val="24"/>
-          <w:szCs w:val="24"/>
-          <w:shd w:val="pct15" w:color="auto" w:fill="FFFFFF"/>
-        </w:rPr>
-      </w:pPr>
-      <w:r>
-        <w:rPr>
-          <w:rFonts w:ascii="楷体" w:eastAsia="楷体" w:hAnsi="楷体" w:hint="eastAsia"/>
-          <w:sz w:val="24"/>
-          <w:szCs w:val="24"/>
-          <w:shd w:val="pct15" w:color="auto" w:fill="FFFFFF"/>
-        </w:rPr>
-        <w:t xml:space="preserve">　　舍利弗。我见是利。故说此言。若有众生闻是说者。应当发愿生彼国土。</w:t>
+        <w:t>若一日若二日若三日若四日若五日若六日若七日。一心不乱。其人临命终时。阿弥陀佛与诸圣众现在其前。是人终时心不颠倒。即得往生阿弥陀佛极乐国土。舍利弗。我见是利。故说此言。若有众生闻是说者。应当发愿生彼国土。</w:t>
       </w:r>
     </w:p>
     <w:p>
@@ -676,6 +518,44 @@
           <w:szCs w:val="24"/>
           <w:shd w:val="pct15" w:color="auto" w:fill="FFFFFF"/>
         </w:rPr>
+        <w:t>汝等众生当信是称赞不可思议功德一切诸佛所护</w:t>
+      </w:r>
+      <w:r>
+        <w:rPr>
+          <w:rFonts w:ascii="楷体" w:eastAsia="楷体" w:hAnsi="楷体" w:hint="eastAsia"/>
+          <w:sz w:val="24"/>
+          <w:szCs w:val="24"/>
+          <w:shd w:val="pct15" w:color="auto" w:fill="FFFFFF"/>
+        </w:rPr>
+        <w:lastRenderedPageBreak/>
+        <w:t>念经。</w:t>
+      </w:r>
+    </w:p>
+    <w:p>
+      <w:pPr>
+        <w:rPr>
+          <w:rFonts w:ascii="楷体" w:eastAsia="楷体" w:hAnsi="楷体"/>
+          <w:sz w:val="24"/>
+          <w:szCs w:val="24"/>
+          <w:shd w:val="pct15" w:color="auto" w:fill="FFFFFF"/>
+        </w:rPr>
+      </w:pPr>
+      <w:r>
+        <w:rPr>
+          <w:rFonts w:ascii="楷体" w:eastAsia="楷体" w:hAnsi="楷体" w:hint="eastAsia"/>
+          <w:sz w:val="24"/>
+          <w:szCs w:val="24"/>
+          <w:shd w:val="pct15" w:color="auto" w:fill="FFFFFF"/>
+        </w:rPr>
+        <w:t xml:space="preserve">　　舍利弗。南方世界有日月灯佛。名闻光佛。大焰肩佛。须弥灯佛。无量精进佛。如是等恒河沙数诸佛。各于其国出广长舌相。遍覆三千大千世界。说诚实言。</w:t>
+      </w:r>
+      <w:r>
+        <w:rPr>
+          <w:rFonts w:ascii="楷体" w:eastAsia="楷体" w:hAnsi="楷体" w:hint="eastAsia"/>
+          <w:sz w:val="24"/>
+          <w:szCs w:val="24"/>
+          <w:shd w:val="pct15" w:color="auto" w:fill="FFFFFF"/>
+        </w:rPr>
         <w:t>汝等众生当信是称赞不可思议功德一切诸佛所护念经。</w:t>
       </w:r>
     </w:p>
@@ -695,8 +575,7 @@
           <w:szCs w:val="24"/>
           <w:shd w:val="pct15" w:color="auto" w:fill="FFFFFF"/>
         </w:rPr>
-        <w:lastRenderedPageBreak/>
-        <w:t xml:space="preserve">　　舍利弗。南方世界有日月灯佛。名闻光佛。大焰肩佛。须弥灯佛。无量精进佛。如是等恒河沙数诸佛。各于其国出广长舌相。遍覆三千大千世界。说诚实言。</w:t>
+        <w:t xml:space="preserve">　　舍利弗。西方世界有无量寿佛。无量相佛。无量幢佛。大光佛。大明佛。宝相佛。净光佛。如是等恒河沙数诸佛。各于其国出广长舌相。遍覆三千大千世界。说诚实言。</w:t>
       </w:r>
       <w:r>
         <w:rPr>
@@ -724,7 +603,7 @@
           <w:szCs w:val="24"/>
           <w:shd w:val="pct15" w:color="auto" w:fill="FFFFFF"/>
         </w:rPr>
-        <w:t xml:space="preserve">　　舍利弗。西方世界有无量寿佛。无量相佛。无量幢佛。大光佛。大明佛。宝相佛。净光佛。如是等恒河沙数诸佛。各于其国出广长舌相。遍覆三千大千世界。说诚实言。</w:t>
+        <w:t xml:space="preserve">　　舍利弗。北方世界有焰肩佛。最胜音佛。难沮佛。日生佛。网明佛。如是等恒河沙数诸佛。各于其国出广长舌相。遍覆三千大千世界。说诚实言。</w:t>
       </w:r>
       <w:r>
         <w:rPr>
@@ -752,7 +631,7 @@
           <w:szCs w:val="24"/>
           <w:shd w:val="pct15" w:color="auto" w:fill="FFFFFF"/>
         </w:rPr>
-        <w:t xml:space="preserve">　　舍利弗。北方世界有焰肩佛。最胜音佛。难沮佛。日生佛。网明佛。如是等恒河沙数诸佛。各于其国出广长舌相。遍覆三千大千世界。说诚实言。</w:t>
+        <w:t xml:space="preserve">　　舍利弗。下方世界有师子佛。名闻佛。名光佛。达摩佛。法幢佛。持法佛。如是等恒河沙数诸佛。各于其国出广长舌相。遍覆三千大千世界。说诚实言。</w:t>
       </w:r>
       <w:r>
         <w:rPr>
@@ -780,7 +659,7 @@
           <w:szCs w:val="24"/>
           <w:shd w:val="pct15" w:color="auto" w:fill="FFFFFF"/>
         </w:rPr>
-        <w:t xml:space="preserve">　　舍利弗。下方世界有师子佛。名闻佛。名光佛。达摩佛。法幢佛。持法佛。如是等恒河沙数诸佛。各于其国出广长舌相。遍覆三千大千世界。说诚实言。</w:t>
+        <w:t xml:space="preserve">　　舍利弗。上方世界有梵音佛。宿王佛。香上佛。香光佛。大焰肩佛。杂色宝华严身佛。娑罗树王佛。宝华德佛。见一切义佛。如须弥山佛。如是等恒河沙数诸佛。各于其国出广长舌相。遍覆三千大千世界。说诚实言。</w:t>
       </w:r>
       <w:r>
         <w:rPr>
@@ -808,189 +687,7 @@
           <w:szCs w:val="24"/>
           <w:shd w:val="pct15" w:color="auto" w:fill="FFFFFF"/>
         </w:rPr>
-        <w:t xml:space="preserve">　　舍利弗。上方世界有梵音佛。宿王佛。香上佛。香光佛。大焰肩佛。杂色宝华严身佛。娑罗树王佛。宝华德佛。见一切义佛。如须弥山佛。如是等恒河沙数诸佛。各于其国出广长舌相。遍覆三千大千世界。说诚实言。</w:t>
-      </w:r>
-      <w:r>
-        <w:rPr>
-          <w:rFonts w:ascii="楷体" w:eastAsia="楷体" w:hAnsi="楷体" w:hint="eastAsia"/>
-          <w:sz w:val="24"/>
-          <w:szCs w:val="24"/>
-          <w:shd w:val="pct15" w:color="auto" w:fill="FFFFFF"/>
-        </w:rPr>
-        <w:t>汝等众生当信是称赞不可思议功德一切诸佛所护念经。</w:t>
-      </w:r>
-    </w:p>
-    <w:p>
-      <w:pPr>
-        <w:rPr>
-          <w:rFonts w:ascii="楷体" w:eastAsia="楷体" w:hAnsi="楷体"/>
-          <w:sz w:val="24"/>
-          <w:szCs w:val="24"/>
-          <w:shd w:val="pct15" w:color="auto" w:fill="FFFFFF"/>
-        </w:rPr>
-      </w:pPr>
-      <w:r>
-        <w:rPr>
-          <w:rFonts w:ascii="楷体" w:eastAsia="楷体" w:hAnsi="楷体" w:hint="eastAsia"/>
-          <w:sz w:val="24"/>
-          <w:szCs w:val="24"/>
-          <w:shd w:val="pct15" w:color="auto" w:fill="FFFFFF"/>
-        </w:rPr>
-        <w:t xml:space="preserve">　　舍利弗。于汝意云何。何故名为一切诸佛所护念经。</w:t>
-      </w:r>
-    </w:p>
-    <w:p>
-      <w:pPr>
-        <w:rPr>
-          <w:rFonts w:ascii="楷体" w:eastAsia="楷体" w:hAnsi="楷体"/>
-          <w:sz w:val="24"/>
-          <w:szCs w:val="24"/>
-          <w:shd w:val="pct15" w:color="auto" w:fill="FFFFFF"/>
-        </w:rPr>
-      </w:pPr>
-      <w:r>
-        <w:rPr>
-          <w:rFonts w:ascii="楷体" w:eastAsia="楷体" w:hAnsi="楷体" w:hint="eastAsia"/>
-          <w:sz w:val="24"/>
-          <w:szCs w:val="24"/>
-          <w:shd w:val="pct15" w:color="auto" w:fill="FFFFFF"/>
-        </w:rPr>
-        <w:t xml:space="preserve">　　舍利弗。若有善男子善女人闻是经受持者</w:t>
-      </w:r>
-      <w:r>
-        <w:rPr>
-          <w:rFonts w:ascii="楷体" w:eastAsia="楷体" w:hAnsi="楷体" w:hint="eastAsia"/>
-          <w:sz w:val="24"/>
-          <w:szCs w:val="24"/>
-          <w:shd w:val="pct15" w:color="auto" w:fill="FFFFFF"/>
-        </w:rPr>
-        <w:t>。</w:t>
-      </w:r>
-      <w:r>
-        <w:rPr>
-          <w:rFonts w:ascii="楷体" w:eastAsia="楷体" w:hAnsi="楷体" w:hint="eastAsia"/>
-          <w:sz w:val="24"/>
-          <w:szCs w:val="24"/>
-          <w:shd w:val="pct15" w:color="auto" w:fill="FFFFFF"/>
-        </w:rPr>
-        <w:t>及闻诸佛名者。是诸善男子善女人皆为一切诸佛共所护念。皆得不退转于阿耨多罗三藐三菩提。是故舍利弗。汝等皆当信受我语及诸佛所说。</w:t>
-      </w:r>
-    </w:p>
-    <w:p>
-      <w:pPr>
-        <w:rPr>
-          <w:rFonts w:ascii="楷体" w:eastAsia="楷体" w:hAnsi="楷体"/>
-          <w:sz w:val="24"/>
-          <w:szCs w:val="24"/>
-          <w:shd w:val="pct15" w:color="auto" w:fill="FFFFFF"/>
-        </w:rPr>
-      </w:pPr>
-      <w:r>
-        <w:rPr>
-          <w:rFonts w:ascii="楷体" w:eastAsia="楷体" w:hAnsi="楷体" w:hint="eastAsia"/>
-          <w:sz w:val="24"/>
-          <w:szCs w:val="24"/>
-          <w:shd w:val="pct15" w:color="auto" w:fill="FFFFFF"/>
-        </w:rPr>
-        <w:t xml:space="preserve">　　舍利弗。若有人已发愿今发愿当发愿。欲生阿弥陀佛国者。是诸人等皆得不退转于阿耨多罗三藐三菩提。于彼国土若已生若今生若当生。是故舍利弗。诸善男子善女人若有信者。应当发愿生彼国土。</w:t>
-      </w:r>
-    </w:p>
-    <w:p>
-      <w:pPr>
-        <w:rPr>
-          <w:rFonts w:ascii="楷体" w:eastAsia="楷体" w:hAnsi="楷体"/>
-          <w:sz w:val="24"/>
-          <w:szCs w:val="24"/>
-          <w:shd w:val="pct15" w:color="auto" w:fill="FFFFFF"/>
-        </w:rPr>
-      </w:pPr>
-      <w:r>
-        <w:rPr>
-          <w:rFonts w:ascii="楷体" w:eastAsia="楷体" w:hAnsi="楷体" w:hint="eastAsia"/>
-          <w:sz w:val="24"/>
-          <w:szCs w:val="24"/>
-          <w:shd w:val="pct15" w:color="auto" w:fill="FFFFFF"/>
-        </w:rPr>
-        <w:t xml:space="preserve">　　舍利弗。如我今者称赞诸佛不可思议功德。彼诸佛等亦称说我不可思议功德而作是言。释迦牟尼佛能为甚难希有之事。能于娑婆国土五浊恶世。劫浊。见浊。烦恼浊。众生浊。命浊中得阿耨多罗三藐三菩提。</w:t>
-      </w:r>
-      <w:r>
-        <w:rPr>
-          <w:rFonts w:ascii="楷体" w:eastAsia="楷体" w:hAnsi="楷体" w:hint="eastAsia"/>
-          <w:sz w:val="24"/>
-          <w:szCs w:val="24"/>
-          <w:shd w:val="pct15" w:color="auto" w:fill="FFFFFF"/>
-        </w:rPr>
-        <w:t>为诸众生说是一切世间难信之法。</w:t>
-      </w:r>
-    </w:p>
-    <w:p>
-      <w:pPr>
-        <w:rPr>
-          <w:rFonts w:ascii="楷体" w:eastAsia="楷体" w:hAnsi="楷体"/>
-          <w:sz w:val="24"/>
-          <w:szCs w:val="24"/>
-          <w:shd w:val="pct15" w:color="auto" w:fill="FFFFFF"/>
-        </w:rPr>
-      </w:pPr>
-      <w:r>
-        <w:rPr>
-          <w:rFonts w:ascii="楷体" w:eastAsia="楷体" w:hAnsi="楷体" w:hint="eastAsia"/>
-          <w:sz w:val="24"/>
-          <w:szCs w:val="24"/>
-          <w:shd w:val="pct15" w:color="auto" w:fill="FFFFFF"/>
-        </w:rPr>
-        <w:t xml:space="preserve">　　舍利弗。当知我于五浊恶世行此难事。得阿耨多罗三藐三菩提。为一切世间说此难信之法。是为甚难。</w:t>
-      </w:r>
-    </w:p>
-    <w:p>
-      <w:pPr>
-        <w:ind w:firstLine="480"/>
-        <w:rPr>
-          <w:rFonts w:ascii="楷体" w:eastAsia="楷体" w:hAnsi="楷体"/>
-          <w:sz w:val="24"/>
-          <w:szCs w:val="24"/>
-          <w:shd w:val="pct15" w:color="auto" w:fill="FFFFFF"/>
-        </w:rPr>
-      </w:pPr>
-      <w:r>
-        <w:rPr>
-          <w:rFonts w:ascii="楷体" w:eastAsia="楷体" w:hAnsi="楷体" w:hint="eastAsia"/>
-          <w:sz w:val="24"/>
-          <w:szCs w:val="24"/>
-          <w:shd w:val="pct15" w:color="auto" w:fill="FFFFFF"/>
-        </w:rPr>
-        <w:t>佛说此经已。舍利弗及诸比丘。一切世间天人阿修罗等。闻佛所说。欢喜信受。作礼而去。</w:t>
-      </w:r>
-    </w:p>
-    <w:p>
-      <w:pPr>
-        <w:ind w:firstLine="480"/>
-        <w:rPr>
-          <w:rFonts w:ascii="楷体" w:eastAsia="楷体" w:hAnsi="楷体"/>
-          <w:sz w:val="24"/>
-          <w:szCs w:val="24"/>
-          <w:shd w:val="pct15" w:color="auto" w:fill="FFFFFF"/>
-        </w:rPr>
-      </w:pPr>
-    </w:p>
-    <w:p>
-      <w:pPr>
-        <w:ind w:firstLineChars="200" w:firstLine="480"/>
-        <w:rPr>
-          <w:rFonts w:ascii="楷体" w:eastAsia="楷体" w:hAnsi="楷体"/>
-          <w:sz w:val="24"/>
-          <w:szCs w:val="24"/>
-          <w:shd w:val="pct15" w:color="auto" w:fill="FFFFFF"/>
-        </w:rPr>
-      </w:pPr>
-      <w:r>
-        <w:rPr>
-          <w:rFonts w:ascii="楷体" w:eastAsia="楷体" w:hAnsi="楷体" w:hint="eastAsia"/>
-          <w:sz w:val="24"/>
-          <w:szCs w:val="24"/>
-          <w:shd w:val="pct15" w:color="auto" w:fill="FFFFFF"/>
-        </w:rPr>
-        <w:t>无量寿佛说往生净土咒。诵此咒者。阿弥陀佛常住其顶。命终之后任运往生。龙树菩萨愿生安养。梦感此咒。耶舍三藏诵此咒。天平寺锈法师从耶舍三藏口受此咒。其人云。经本外国不来。受持咒法。日夜六时各诵三七遍。晨夜澡漱。嚼杨枝。然香火。于形象前跪。合掌诵三七遍。日日恒尔。即灭四重。五逆。十恶。谤方等罪悉得除灭。现在不为一切诸邪鬼神之所恼乱。命终之后任运往生</w:t>
+        <w:t xml:space="preserve">　　舍利弗。于汝意云何。何故名为一切诸佛所护念经。舍利弗。若有善男子善女人闻是经受持者</w:t>
       </w:r>
       <w:bookmarkStart w:id="0" w:name="_GoBack"/>
       <w:bookmarkEnd w:id="0"/>
@@ -1001,7 +698,114 @@
           <w:szCs w:val="24"/>
           <w:shd w:val="pct15" w:color="auto" w:fill="FFFFFF"/>
         </w:rPr>
-        <w:t>阿弥陀国。</w:t>
+        <w:t>及闻诸佛名者。是诸善男子善女人皆为一切诸佛共所护念。皆得不退转于阿耨多罗三藐三菩提。是故舍利弗。汝等皆当信受我语及诸佛所说。</w:t>
+      </w:r>
+    </w:p>
+    <w:p>
+      <w:pPr>
+        <w:rPr>
+          <w:rFonts w:ascii="楷体" w:eastAsia="楷体" w:hAnsi="楷体"/>
+          <w:sz w:val="24"/>
+          <w:szCs w:val="24"/>
+          <w:shd w:val="pct15" w:color="auto" w:fill="FFFFFF"/>
+        </w:rPr>
+      </w:pPr>
+      <w:r>
+        <w:rPr>
+          <w:rFonts w:ascii="楷体" w:eastAsia="楷体" w:hAnsi="楷体" w:hint="eastAsia"/>
+          <w:sz w:val="24"/>
+          <w:szCs w:val="24"/>
+          <w:shd w:val="pct15" w:color="auto" w:fill="FFFFFF"/>
+        </w:rPr>
+        <w:t xml:space="preserve">　　舍利弗。若有人已发愿今发愿当发愿。欲生阿弥陀佛国者。是诸人等皆得不退转于阿耨多罗三藐三菩提。于彼国土若已生若今生若当生。是故舍利弗。诸善男子善女人若有信者。应当发愿生彼国土。</w:t>
+      </w:r>
+    </w:p>
+    <w:p>
+      <w:pPr>
+        <w:rPr>
+          <w:rFonts w:ascii="楷体" w:eastAsia="楷体" w:hAnsi="楷体"/>
+          <w:sz w:val="24"/>
+          <w:szCs w:val="24"/>
+          <w:shd w:val="pct15" w:color="auto" w:fill="FFFFFF"/>
+        </w:rPr>
+      </w:pPr>
+      <w:r>
+        <w:rPr>
+          <w:rFonts w:ascii="楷体" w:eastAsia="楷体" w:hAnsi="楷体" w:hint="eastAsia"/>
+          <w:sz w:val="24"/>
+          <w:szCs w:val="24"/>
+          <w:shd w:val="pct15" w:color="auto" w:fill="FFFFFF"/>
+        </w:rPr>
+        <w:t xml:space="preserve">　　舍利弗。如我今者称赞诸佛不可思议功德。彼诸佛等亦称说我不可思议功德而作是言。释迦牟尼佛能为甚难希有之事。能于娑婆国土五浊恶世。劫浊。见浊。烦恼浊。众生浊。命浊中得阿耨多罗三藐三菩提。</w:t>
+      </w:r>
+      <w:r>
+        <w:rPr>
+          <w:rFonts w:ascii="楷体" w:eastAsia="楷体" w:hAnsi="楷体" w:hint="eastAsia"/>
+          <w:sz w:val="24"/>
+          <w:szCs w:val="24"/>
+          <w:shd w:val="pct15" w:color="auto" w:fill="FFFFFF"/>
+        </w:rPr>
+        <w:t>为诸众生说是一切世间难信之法。</w:t>
+      </w:r>
+      <w:r>
+        <w:rPr>
+          <w:rFonts w:ascii="楷体" w:eastAsia="楷体" w:hAnsi="楷体" w:hint="eastAsia"/>
+          <w:sz w:val="24"/>
+          <w:szCs w:val="24"/>
+          <w:shd w:val="pct15" w:color="auto" w:fill="FFFFFF"/>
+        </w:rPr>
+        <w:t>舍利弗。当知我于五浊恶世行此难事。得阿耨多罗三藐三菩提。为一切世间说此难信之法。是为甚难。</w:t>
+      </w:r>
+    </w:p>
+    <w:p>
+      <w:pPr>
+        <w:ind w:firstLine="480"/>
+        <w:rPr>
+          <w:rFonts w:ascii="楷体" w:eastAsia="楷体" w:hAnsi="楷体"/>
+          <w:sz w:val="24"/>
+          <w:szCs w:val="24"/>
+          <w:shd w:val="pct15" w:color="auto" w:fill="FFFFFF"/>
+        </w:rPr>
+      </w:pPr>
+      <w:r>
+        <w:rPr>
+          <w:rFonts w:ascii="楷体" w:eastAsia="楷体" w:hAnsi="楷体" w:hint="eastAsia"/>
+          <w:sz w:val="24"/>
+          <w:szCs w:val="24"/>
+          <w:shd w:val="pct15" w:color="auto" w:fill="FFFFFF"/>
+        </w:rPr>
+        <w:t>佛说此经已。舍利弗及诸比丘。一切世间天人阿修罗等。闻佛所说。欢喜信受。作礼而去。</w:t>
+      </w:r>
+    </w:p>
+    <w:p>
+      <w:pPr>
+        <w:ind w:firstLine="480"/>
+        <w:rPr>
+          <w:rFonts w:ascii="楷体" w:eastAsia="楷体" w:hAnsi="楷体"/>
+          <w:sz w:val="24"/>
+          <w:szCs w:val="24"/>
+          <w:shd w:val="pct15" w:color="auto" w:fill="FFFFFF"/>
+        </w:rPr>
+      </w:pPr>
+    </w:p>
+    <w:p>
+      <w:pPr>
+        <w:ind w:firstLineChars="200" w:firstLine="480"/>
+        <w:rPr>
+          <w:rFonts w:ascii="楷体" w:eastAsia="楷体" w:hAnsi="楷体"/>
+          <w:sz w:val="24"/>
+          <w:szCs w:val="24"/>
+          <w:shd w:val="pct15" w:color="auto" w:fill="FFFFFF"/>
+        </w:rPr>
+      </w:pPr>
+      <w:r>
+        <w:rPr>
+          <w:rFonts w:ascii="楷体" w:eastAsia="楷体" w:hAnsi="楷体" w:hint="eastAsia"/>
+          <w:sz w:val="24"/>
+          <w:szCs w:val="24"/>
+          <w:shd w:val="pct15" w:color="auto" w:fill="FFFFFF"/>
+        </w:rPr>
+        <w:t>无量寿佛说往生净土咒。诵此咒者。阿弥陀佛常住其顶。命终之后任运往生。龙树菩萨愿生安养。梦感此咒。耶舍三藏诵此咒。天平寺锈法师从耶舍三藏口受此咒。其人云。经本外国不来。受持咒法。日夜六时各诵三七遍。晨夜澡漱。嚼杨枝。然香火。于形象前跪。合掌诵三七遍。日日恒尔。即灭四重。五逆。十恶。谤方等罪悉得除灭。现在不为一切诸邪鬼神之所恼乱。命终之后任运往生阿弥陀国。</w:t>
       </w:r>
       <w:r>
         <w:rPr>
@@ -1015,7 +819,7 @@
     </w:p>
     <w:sectPr>
       <w:pgSz w:w="11906" w:h="16838"/>
-      <w:pgMar w:top="1021" w:right="1440" w:bottom="1021" w:left="1440" w:header="851" w:footer="992" w:gutter="0"/>
+      <w:pgMar w:top="1440" w:right="1800" w:bottom="1440" w:left="1800" w:header="851" w:footer="992" w:gutter="0"/>
       <w:cols w:space="425"/>
       <w:docGrid w:type="lines" w:linePitch="312"/>
     </w:sectPr>

</xml_diff>

<commit_message>
Site updated: 2022-04-17 10:29:07
</commit_message>
<xml_diff>
--- a/treasure/download/经藏/宝积部-65部/新建文件夹/佛说阿弥陀经-姚秦-鸠摩罗什.docx
+++ b/treasure/download/经藏/宝积部-65部/新建文件夹/佛说阿弥陀经-姚秦-鸠摩罗什.docx
@@ -4,15 +4,13 @@
   <w:body>
     <w:p>
       <w:pPr>
-        <w:jc w:val="center"/>
-        <w:rPr>
-          <w:rFonts w:ascii="楷体" w:eastAsia="楷体" w:hAnsi="楷体"/>
-          <w:sz w:val="24"/>
-          <w:szCs w:val="24"/>
-          <w:shd w:val="pct15" w:color="auto" w:fill="FFFFFF"/>
-        </w:rPr>
-      </w:pPr>
-      <w:bookmarkStart w:id="0" w:name="_GoBack"/>
+        <w:rPr>
+          <w:rFonts w:ascii="楷体" w:eastAsia="楷体" w:hAnsi="楷体"/>
+          <w:sz w:val="24"/>
+          <w:szCs w:val="24"/>
+          <w:shd w:val="pct15" w:color="auto" w:fill="FFFFFF"/>
+        </w:rPr>
+      </w:pPr>
       <w:r>
         <w:rPr>
           <w:rFonts w:ascii="楷体" w:eastAsia="楷体" w:hAnsi="楷体" w:hint="eastAsia"/>
@@ -22,24 +20,17 @@
         </w:rPr>
         <w:t>佛说阿弥陀经</w:t>
       </w:r>
-      <w:r>
-        <w:rPr>
-          <w:rFonts w:ascii="楷体" w:eastAsia="楷体" w:hAnsi="楷体" w:hint="eastAsia"/>
-          <w:sz w:val="24"/>
-          <w:szCs w:val="24"/>
-          <w:shd w:val="pct15" w:color="auto" w:fill="FFFFFF"/>
-        </w:rPr>
-        <w:t xml:space="preserve"> </w:t>
-      </w:r>
-      <w:r>
-        <w:rPr>
-          <w:rFonts w:ascii="楷体" w:eastAsia="楷体" w:hAnsi="楷体"/>
-          <w:sz w:val="24"/>
-          <w:szCs w:val="24"/>
-          <w:shd w:val="pct15" w:color="auto" w:fill="FFFFFF"/>
-        </w:rPr>
-        <w:t xml:space="preserve"> </w:t>
-      </w:r>
+    </w:p>
+    <w:p>
+      <w:pPr>
+        <w:ind w:firstLineChars="200" w:firstLine="480"/>
+        <w:rPr>
+          <w:rFonts w:ascii="楷体" w:eastAsia="楷体" w:hAnsi="楷体"/>
+          <w:sz w:val="24"/>
+          <w:szCs w:val="24"/>
+          <w:shd w:val="pct15" w:color="auto" w:fill="FFFFFF"/>
+        </w:rPr>
+      </w:pPr>
       <w:r>
         <w:rPr>
           <w:rFonts w:ascii="楷体" w:eastAsia="楷体" w:hAnsi="楷体" w:hint="eastAsia"/>
@@ -290,21 +281,22 @@
     </w:p>
     <w:p>
       <w:pPr>
-        <w:rPr>
-          <w:rFonts w:ascii="楷体" w:eastAsia="楷体" w:hAnsi="楷体"/>
-          <w:sz w:val="24"/>
-          <w:szCs w:val="24"/>
-          <w:shd w:val="pct15" w:color="auto" w:fill="FFFFFF"/>
-        </w:rPr>
-      </w:pPr>
-      <w:r>
-        <w:rPr>
-          <w:rFonts w:ascii="楷体" w:eastAsia="楷体" w:hAnsi="楷体" w:hint="eastAsia"/>
-          <w:sz w:val="24"/>
-          <w:szCs w:val="24"/>
-          <w:shd w:val="pct15" w:color="auto" w:fill="FFFFFF"/>
-        </w:rPr>
-        <w:t xml:space="preserve">　　复次舍利弗。彼国常有种种奇妙杂色之鸟。白</w:t>
+        <w:ind w:firstLine="480"/>
+        <w:rPr>
+          <w:rFonts w:ascii="楷体" w:eastAsia="楷体" w:hAnsi="楷体"/>
+          <w:sz w:val="24"/>
+          <w:szCs w:val="24"/>
+          <w:shd w:val="pct15" w:color="auto" w:fill="FFFFFF"/>
+        </w:rPr>
+      </w:pPr>
+      <w:r>
+        <w:rPr>
+          <w:rFonts w:ascii="楷体" w:eastAsia="楷体" w:hAnsi="楷体" w:hint="eastAsia"/>
+          <w:sz w:val="24"/>
+          <w:szCs w:val="24"/>
+          <w:shd w:val="pct15" w:color="auto" w:fill="FFFFFF"/>
+        </w:rPr>
+        <w:t>复次舍利弗。彼国常有种种奇妙杂色之鸟。白</w:t>
       </w:r>
       <w:r>
         <w:rPr>
@@ -495,21 +487,22 @@
     </w:p>
     <w:p>
       <w:pPr>
-        <w:rPr>
-          <w:rFonts w:ascii="楷体" w:eastAsia="楷体" w:hAnsi="楷体"/>
-          <w:sz w:val="24"/>
-          <w:szCs w:val="24"/>
-          <w:shd w:val="pct15" w:color="auto" w:fill="FFFFFF"/>
-        </w:rPr>
-      </w:pPr>
-      <w:r>
-        <w:rPr>
-          <w:rFonts w:ascii="楷体" w:eastAsia="楷体" w:hAnsi="楷体" w:hint="eastAsia"/>
-          <w:sz w:val="24"/>
-          <w:szCs w:val="24"/>
-          <w:shd w:val="pct15" w:color="auto" w:fill="FFFFFF"/>
-        </w:rPr>
-        <w:t xml:space="preserve">　　又舍</w:t>
+        <w:ind w:firstLine="480"/>
+        <w:rPr>
+          <w:rFonts w:ascii="楷体" w:eastAsia="楷体" w:hAnsi="楷体"/>
+          <w:sz w:val="24"/>
+          <w:szCs w:val="24"/>
+          <w:shd w:val="pct15" w:color="auto" w:fill="FFFFFF"/>
+        </w:rPr>
+      </w:pPr>
+      <w:r>
+        <w:rPr>
+          <w:rFonts w:ascii="楷体" w:eastAsia="楷体" w:hAnsi="楷体" w:hint="eastAsia"/>
+          <w:sz w:val="24"/>
+          <w:szCs w:val="24"/>
+          <w:shd w:val="pct15" w:color="auto" w:fill="FFFFFF"/>
+        </w:rPr>
+        <w:t>又舍</w:t>
       </w:r>
       <w:r>
         <w:rPr>
@@ -605,52 +598,16 @@
           <w:szCs w:val="24"/>
           <w:shd w:val="pct15" w:color="auto" w:fill="FFFFFF"/>
         </w:rPr>
-        <w:t>。东方亦有阿閦鞞佛</w:t>
-      </w:r>
-      <w:r>
-        <w:rPr>
-          <w:rFonts w:ascii="楷体" w:eastAsia="楷体" w:hAnsi="楷体" w:hint="eastAsia"/>
-          <w:sz w:val="24"/>
-          <w:szCs w:val="24"/>
-          <w:shd w:val="pct15" w:color="auto" w:fill="FFFFFF"/>
-        </w:rPr>
-        <w:t xml:space="preserve"> </w:t>
-      </w:r>
-      <w:r>
-        <w:rPr>
-          <w:rFonts w:ascii="楷体" w:eastAsia="楷体" w:hAnsi="楷体" w:hint="eastAsia"/>
-          <w:sz w:val="24"/>
-          <w:szCs w:val="24"/>
-          <w:shd w:val="pct15" w:color="auto" w:fill="FFFFFF"/>
-        </w:rPr>
-        <w:t>须弥相佛</w:t>
-      </w:r>
-      <w:r>
-        <w:rPr>
-          <w:rFonts w:ascii="楷体" w:eastAsia="楷体" w:hAnsi="楷体" w:hint="eastAsia"/>
-          <w:sz w:val="24"/>
-          <w:szCs w:val="24"/>
-          <w:shd w:val="pct15" w:color="auto" w:fill="FFFFFF"/>
-        </w:rPr>
-        <w:t xml:space="preserve"> </w:t>
-      </w:r>
-      <w:r>
-        <w:rPr>
-          <w:rFonts w:ascii="楷体" w:eastAsia="楷体" w:hAnsi="楷体" w:hint="eastAsia"/>
-          <w:sz w:val="24"/>
-          <w:szCs w:val="24"/>
-          <w:shd w:val="pct15" w:color="auto" w:fill="FFFFFF"/>
-        </w:rPr>
-        <w:t>大须</w:t>
-      </w:r>
-      <w:r>
-        <w:rPr>
-          <w:rFonts w:ascii="楷体" w:eastAsia="楷体" w:hAnsi="楷体" w:hint="eastAsia"/>
-          <w:sz w:val="24"/>
-          <w:szCs w:val="24"/>
-          <w:shd w:val="pct15" w:color="auto" w:fill="FFFFFF"/>
-        </w:rPr>
-        <w:t>弥佛 须弥光佛 妙音佛。如是等恒河沙数诸佛各于其国出广长舌相遍覆三千大千世界</w:t>
+        <w:t>。东方亦有阿閦鞞佛须弥相佛大须</w:t>
+      </w:r>
+      <w:r>
+        <w:rPr>
+          <w:rFonts w:ascii="楷体" w:eastAsia="楷体" w:hAnsi="楷体" w:hint="eastAsia"/>
+          <w:sz w:val="24"/>
+          <w:szCs w:val="24"/>
+          <w:shd w:val="pct15" w:color="auto" w:fill="FFFFFF"/>
+        </w:rPr>
+        <w:t>弥佛须弥光佛妙音佛。如是等恒河沙数诸佛各于其国出广长舌相遍覆三千大千世界</w:t>
       </w:r>
       <w:r>
         <w:rPr>
@@ -885,21 +842,22 @@
     </w:p>
     <w:p>
       <w:pPr>
-        <w:rPr>
-          <w:rFonts w:ascii="楷体" w:eastAsia="楷体" w:hAnsi="楷体"/>
-          <w:sz w:val="24"/>
-          <w:szCs w:val="24"/>
-          <w:shd w:val="pct15" w:color="auto" w:fill="FFFFFF"/>
-        </w:rPr>
-      </w:pPr>
-      <w:r>
-        <w:rPr>
-          <w:rFonts w:ascii="楷体" w:eastAsia="楷体" w:hAnsi="楷体" w:hint="eastAsia"/>
-          <w:sz w:val="24"/>
-          <w:szCs w:val="24"/>
-          <w:shd w:val="pct15" w:color="auto" w:fill="FFFFFF"/>
-        </w:rPr>
-        <w:t xml:space="preserve">　　舍利弗。北方世界有焰肩佛</w:t>
+        <w:ind w:firstLine="480"/>
+        <w:rPr>
+          <w:rFonts w:ascii="楷体" w:eastAsia="楷体" w:hAnsi="楷体"/>
+          <w:sz w:val="24"/>
+          <w:szCs w:val="24"/>
+          <w:shd w:val="pct15" w:color="auto" w:fill="FFFFFF"/>
+        </w:rPr>
+      </w:pPr>
+      <w:r>
+        <w:rPr>
+          <w:rFonts w:ascii="楷体" w:eastAsia="楷体" w:hAnsi="楷体" w:hint="eastAsia"/>
+          <w:sz w:val="24"/>
+          <w:szCs w:val="24"/>
+          <w:shd w:val="pct15" w:color="auto" w:fill="FFFFFF"/>
+        </w:rPr>
+        <w:t>舍利弗。北方世界有焰肩佛</w:t>
       </w:r>
       <w:r>
         <w:rPr>
@@ -976,21 +934,22 @@
     </w:p>
     <w:p>
       <w:pPr>
-        <w:rPr>
-          <w:rFonts w:ascii="楷体" w:eastAsia="楷体" w:hAnsi="楷体"/>
-          <w:sz w:val="24"/>
-          <w:szCs w:val="24"/>
-          <w:shd w:val="pct15" w:color="auto" w:fill="FFFFFF"/>
-        </w:rPr>
-      </w:pPr>
-      <w:r>
-        <w:rPr>
-          <w:rFonts w:ascii="楷体" w:eastAsia="楷体" w:hAnsi="楷体" w:hint="eastAsia"/>
-          <w:sz w:val="24"/>
-          <w:szCs w:val="24"/>
-          <w:shd w:val="pct15" w:color="auto" w:fill="FFFFFF"/>
-        </w:rPr>
-        <w:t xml:space="preserve">　　舍利弗。下方世界有师子佛 </w:t>
+        <w:ind w:firstLine="480"/>
+        <w:rPr>
+          <w:rFonts w:ascii="楷体" w:eastAsia="楷体" w:hAnsi="楷体"/>
+          <w:sz w:val="24"/>
+          <w:szCs w:val="24"/>
+          <w:shd w:val="pct15" w:color="auto" w:fill="FFFFFF"/>
+        </w:rPr>
+      </w:pPr>
+      <w:r>
+        <w:rPr>
+          <w:rFonts w:ascii="楷体" w:eastAsia="楷体" w:hAnsi="楷体" w:hint="eastAsia"/>
+          <w:sz w:val="24"/>
+          <w:szCs w:val="24"/>
+          <w:shd w:val="pct15" w:color="auto" w:fill="FFFFFF"/>
+        </w:rPr>
+        <w:t xml:space="preserve">舍利弗。下方世界有师子佛 </w:t>
       </w:r>
       <w:r>
         <w:rPr>
@@ -1076,21 +1035,22 @@
     </w:p>
     <w:p>
       <w:pPr>
-        <w:rPr>
-          <w:rFonts w:ascii="楷体" w:eastAsia="楷体" w:hAnsi="楷体"/>
-          <w:sz w:val="24"/>
-          <w:szCs w:val="24"/>
-          <w:shd w:val="pct15" w:color="auto" w:fill="FFFFFF"/>
-        </w:rPr>
-      </w:pPr>
-      <w:r>
-        <w:rPr>
-          <w:rFonts w:ascii="楷体" w:eastAsia="楷体" w:hAnsi="楷体" w:hint="eastAsia"/>
-          <w:sz w:val="24"/>
-          <w:szCs w:val="24"/>
-          <w:shd w:val="pct15" w:color="auto" w:fill="FFFFFF"/>
-        </w:rPr>
-        <w:t xml:space="preserve">　　舍利弗。上方世界有梵音佛</w:t>
+        <w:ind w:firstLine="480"/>
+        <w:rPr>
+          <w:rFonts w:ascii="楷体" w:eastAsia="楷体" w:hAnsi="楷体"/>
+          <w:sz w:val="24"/>
+          <w:szCs w:val="24"/>
+          <w:shd w:val="pct15" w:color="auto" w:fill="FFFFFF"/>
+        </w:rPr>
+      </w:pPr>
+      <w:r>
+        <w:rPr>
+          <w:rFonts w:ascii="楷体" w:eastAsia="楷体" w:hAnsi="楷体" w:hint="eastAsia"/>
+          <w:sz w:val="24"/>
+          <w:szCs w:val="24"/>
+          <w:shd w:val="pct15" w:color="auto" w:fill="FFFFFF"/>
+        </w:rPr>
+        <w:t>舍利弗。上方世界有梵音佛</w:t>
       </w:r>
       <w:r>
         <w:rPr>
@@ -1292,26 +1252,45 @@
           <w:szCs w:val="24"/>
           <w:shd w:val="pct15" w:color="auto" w:fill="FFFFFF"/>
         </w:rPr>
-        <w:t>舍利弗。若有善男子善女人闻是经受持者及闻诸佛名者。是诸善男子善女人皆为一切诸佛共所护念。皆得不退转于阿耨多罗三藐三菩提。是故舍利弗。汝等皆当信受我语及诸佛所说。</w:t>
-      </w:r>
-    </w:p>
-    <w:p>
-      <w:pPr>
-        <w:rPr>
-          <w:rFonts w:ascii="楷体" w:eastAsia="楷体" w:hAnsi="楷体"/>
-          <w:sz w:val="24"/>
-          <w:szCs w:val="24"/>
-          <w:shd w:val="pct15" w:color="auto" w:fill="FFFFFF"/>
-        </w:rPr>
-      </w:pPr>
-      <w:r>
-        <w:rPr>
-          <w:rFonts w:ascii="楷体" w:eastAsia="楷体" w:hAnsi="楷体" w:hint="eastAsia"/>
-          <w:sz w:val="24"/>
-          <w:szCs w:val="24"/>
-          <w:shd w:val="pct15" w:color="auto" w:fill="FFFFFF"/>
-        </w:rPr>
-        <w:t xml:space="preserve">　　舍利弗。若有人已发愿今发愿当发愿</w:t>
+        <w:t>舍利弗。若有善男</w:t>
+      </w:r>
+      <w:r>
+        <w:rPr>
+          <w:rFonts w:ascii="楷体" w:eastAsia="楷体" w:hAnsi="楷体" w:hint="eastAsia"/>
+          <w:sz w:val="24"/>
+          <w:szCs w:val="24"/>
+          <w:shd w:val="pct15" w:color="auto" w:fill="FFFFFF"/>
+        </w:rPr>
+        <w:t>子善女人闻是经受持者及闻诸佛名者。是诸善男子善女人皆为一切诸佛之</w:t>
+      </w:r>
+      <w:r>
+        <w:rPr>
+          <w:rFonts w:ascii="楷体" w:eastAsia="楷体" w:hAnsi="楷体" w:hint="eastAsia"/>
+          <w:sz w:val="24"/>
+          <w:szCs w:val="24"/>
+          <w:shd w:val="pct15" w:color="auto" w:fill="FFFFFF"/>
+        </w:rPr>
+        <w:t>所护念。皆得不退转于阿耨多罗三藐三菩提。是故舍利弗。汝等皆当信受我语及诸佛所说。</w:t>
+      </w:r>
+    </w:p>
+    <w:p>
+      <w:pPr>
+        <w:ind w:firstLine="480"/>
+        <w:rPr>
+          <w:rFonts w:ascii="楷体" w:eastAsia="楷体" w:hAnsi="楷体"/>
+          <w:sz w:val="24"/>
+          <w:szCs w:val="24"/>
+          <w:shd w:val="pct15" w:color="auto" w:fill="FFFFFF"/>
+        </w:rPr>
+      </w:pPr>
+      <w:r>
+        <w:rPr>
+          <w:rFonts w:ascii="楷体" w:eastAsia="楷体" w:hAnsi="楷体" w:hint="eastAsia"/>
+          <w:sz w:val="24"/>
+          <w:szCs w:val="24"/>
+          <w:shd w:val="pct15" w:color="auto" w:fill="FFFFFF"/>
+        </w:rPr>
+        <w:t>舍利弗。若有人已发愿今发愿当发愿</w:t>
       </w:r>
       <w:r>
         <w:rPr>
@@ -1425,9 +1404,19 @@
           <w:szCs w:val="24"/>
           <w:shd w:val="pct15" w:color="auto" w:fill="FFFFFF"/>
         </w:rPr>
+        <w:t>。</w:t>
+      </w:r>
+      <w:bookmarkStart w:id="0" w:name="_GoBack"/>
+      <w:bookmarkEnd w:id="0"/>
+      <w:r>
+        <w:rPr>
+          <w:rFonts w:ascii="楷体" w:eastAsia="楷体" w:hAnsi="楷体" w:hint="eastAsia"/>
+          <w:sz w:val="24"/>
+          <w:szCs w:val="24"/>
+          <w:shd w:val="pct15" w:color="auto" w:fill="FFFFFF"/>
+        </w:rPr>
         <w:t>一切世间天人阿修罗等。闻佛所说。欢喜信受。作礼而去。</w:t>
       </w:r>
-      <w:bookmarkEnd w:id="0"/>
     </w:p>
     <w:sectPr>
       <w:pgSz w:w="11906" w:h="16838"/>
@@ -1437,6 +1426,44 @@
     </w:sectPr>
   </w:body>
 </w:document>
+</file>
+
+<file path=word/endnotes.xml><?xml version="1.0" encoding="utf-8"?>
+<w:endnotes xmlns:wpc="http://schemas.microsoft.com/office/word/2010/wordprocessingCanvas" xmlns:cx="http://schemas.microsoft.com/office/drawing/2014/chartex" xmlns:mc="http://schemas.openxmlformats.org/markup-compatibility/2006" xmlns:o="urn:schemas-microsoft-com:office:office" xmlns:r="http://schemas.openxmlformats.org/officeDocument/2006/relationships" xmlns:m="http://schemas.openxmlformats.org/officeDocument/2006/math" xmlns:v="urn:schemas-microsoft-com:vml" xmlns:wp14="http://schemas.microsoft.com/office/word/2010/wordprocessingDrawing" xmlns:wp="http://schemas.openxmlformats.org/drawingml/2006/wordprocessingDrawing" xmlns:w10="urn:schemas-microsoft-com:office:word" xmlns:w="http://schemas.openxmlformats.org/wordprocessingml/2006/main" xmlns:w14="http://schemas.microsoft.com/office/word/2010/wordml" xmlns:w15="http://schemas.microsoft.com/office/word/2012/wordml" xmlns:w16se="http://schemas.microsoft.com/office/word/2015/wordml/symex" xmlns:wpg="http://schemas.microsoft.com/office/word/2010/wordprocessingGroup" xmlns:wpi="http://schemas.microsoft.com/office/word/2010/wordprocessingInk" xmlns:wne="http://schemas.microsoft.com/office/word/2006/wordml" xmlns:wps="http://schemas.microsoft.com/office/word/2010/wordprocessingShape" mc:Ignorable="w14 w15 w16se wp14">
+  <w:endnote w:type="separator" w:id="-1">
+    <w:p>
+      <w:r>
+        <w:separator/>
+      </w:r>
+    </w:p>
+  </w:endnote>
+  <w:endnote w:type="continuationSeparator" w:id="0">
+    <w:p>
+      <w:r>
+        <w:continuationSeparator/>
+      </w:r>
+    </w:p>
+  </w:endnote>
+</w:endnotes>
+</file>
+
+<file path=word/footnotes.xml><?xml version="1.0" encoding="utf-8"?>
+<w:footnotes xmlns:wpc="http://schemas.microsoft.com/office/word/2010/wordprocessingCanvas" xmlns:cx="http://schemas.microsoft.com/office/drawing/2014/chartex" xmlns:mc="http://schemas.openxmlformats.org/markup-compatibility/2006" xmlns:o="urn:schemas-microsoft-com:office:office" xmlns:r="http://schemas.openxmlformats.org/officeDocument/2006/relationships" xmlns:m="http://schemas.openxmlformats.org/officeDocument/2006/math" xmlns:v="urn:schemas-microsoft-com:vml" xmlns:wp14="http://schemas.microsoft.com/office/word/2010/wordprocessingDrawing" xmlns:wp="http://schemas.openxmlformats.org/drawingml/2006/wordprocessingDrawing" xmlns:w10="urn:schemas-microsoft-com:office:word" xmlns:w="http://schemas.openxmlformats.org/wordprocessingml/2006/main" xmlns:w14="http://schemas.microsoft.com/office/word/2010/wordml" xmlns:w15="http://schemas.microsoft.com/office/word/2012/wordml" xmlns:w16se="http://schemas.microsoft.com/office/word/2015/wordml/symex" xmlns:wpg="http://schemas.microsoft.com/office/word/2010/wordprocessingGroup" xmlns:wpi="http://schemas.microsoft.com/office/word/2010/wordprocessingInk" xmlns:wne="http://schemas.microsoft.com/office/word/2006/wordml" xmlns:wps="http://schemas.microsoft.com/office/word/2010/wordprocessingShape" mc:Ignorable="w14 w15 w16se wp14">
+  <w:footnote w:type="separator" w:id="-1">
+    <w:p>
+      <w:r>
+        <w:separator/>
+      </w:r>
+    </w:p>
+  </w:footnote>
+  <w:footnote w:type="continuationSeparator" w:id="0">
+    <w:p>
+      <w:r>
+        <w:continuationSeparator/>
+      </w:r>
+    </w:p>
+  </w:footnote>
+</w:footnotes>
 </file>
 
 <file path=word/styles.xml><?xml version="1.0" encoding="utf-8"?>
@@ -1862,6 +1889,71 @@
     <w:semiHidden/>
     <w:unhideWhenUsed/>
   </w:style>
+  <w:style w:type="paragraph" w:styleId="a3">
+    <w:name w:val="header"/>
+    <w:basedOn w:val="a"/>
+    <w:link w:val="a4"/>
+    <w:uiPriority w:val="99"/>
+    <w:unhideWhenUsed/>
+    <w:rsid w:val="00843E5B"/>
+    <w:pPr>
+      <w:pBdr>
+        <w:bottom w:val="single" w:sz="6" w:space="1" w:color="auto"/>
+      </w:pBdr>
+      <w:tabs>
+        <w:tab w:val="center" w:pos="4153"/>
+        <w:tab w:val="right" w:pos="8306"/>
+      </w:tabs>
+      <w:snapToGrid w:val="0"/>
+      <w:jc w:val="center"/>
+    </w:pPr>
+    <w:rPr>
+      <w:sz w:val="18"/>
+      <w:szCs w:val="18"/>
+    </w:rPr>
+  </w:style>
+  <w:style w:type="character" w:customStyle="1" w:styleId="a4">
+    <w:name w:val="页眉 字符"/>
+    <w:basedOn w:val="a0"/>
+    <w:link w:val="a3"/>
+    <w:uiPriority w:val="99"/>
+    <w:rsid w:val="00843E5B"/>
+    <w:rPr>
+      <w:sz w:val="18"/>
+      <w:szCs w:val="18"/>
+    </w:rPr>
+  </w:style>
+  <w:style w:type="paragraph" w:styleId="a5">
+    <w:name w:val="footer"/>
+    <w:basedOn w:val="a"/>
+    <w:link w:val="a6"/>
+    <w:uiPriority w:val="99"/>
+    <w:unhideWhenUsed/>
+    <w:rsid w:val="00843E5B"/>
+    <w:pPr>
+      <w:tabs>
+        <w:tab w:val="center" w:pos="4153"/>
+        <w:tab w:val="right" w:pos="8306"/>
+      </w:tabs>
+      <w:snapToGrid w:val="0"/>
+      <w:jc w:val="left"/>
+    </w:pPr>
+    <w:rPr>
+      <w:sz w:val="18"/>
+      <w:szCs w:val="18"/>
+    </w:rPr>
+  </w:style>
+  <w:style w:type="character" w:customStyle="1" w:styleId="a6">
+    <w:name w:val="页脚 字符"/>
+    <w:basedOn w:val="a0"/>
+    <w:link w:val="a5"/>
+    <w:uiPriority w:val="99"/>
+    <w:rsid w:val="00843E5B"/>
+    <w:rPr>
+      <w:sz w:val="18"/>
+      <w:szCs w:val="18"/>
+    </w:rPr>
+  </w:style>
 </w:styles>
 </file>
 

</xml_diff>